<commit_message>
Update client summary with headline finding: geo-check likely freezing paint for 9.6s
Co-authored-by: kamranakhtar137-prog <kamranakhtar137-prog@users.noreply.github.com>
</commit_message>
<xml_diff>
--- a/shopify-theme/client-updates/homepage-third-party-scripts-update.docx
+++ b/shopify-theme/client-updates/homepage-third-party-scripts-update.docx
@@ -29,13 +29,13 @@
         <w:t xml:space="preserve">filmartgallery.com</w:t>
       </w:r>
     </w:p>
-    <w:bookmarkStart w:id="20" w:name="summary"/>
+    <w:bookmarkStart w:id="20" w:name="headline-finding"/>
     <w:p>
       <w:pPr>
         <w:pStyle w:val="Heading2"/>
       </w:pPr>
       <w:r>
-        <w:t xml:space="preserve">Summary</w:t>
+        <w:t xml:space="preserve">Headline finding</w:t>
       </w:r>
     </w:p>
     <w:p>
@@ -43,31 +43,62 @@
         <w:pStyle w:val="FirstParagraph"/>
       </w:pPr>
       <w:r>
-        <w:t xml:space="preserve">Crazy Egg, Microsoft Clarity, ClickCease, and Facebook Pixel are already</w:t>
+        <w:t xml:space="preserve">We now have a likely explanation for the 10–20 second speed spike: your</w:t>
       </w:r>
       <w:r>
         <w:t xml:space="preserve"> </w:t>
       </w:r>
       <w:r>
-        <w:t xml:space="preserve">running through Google Tag Manager — they’re not scattered, uncontrolled</w:t>
+        <w:t xml:space="preserve">mobile test shows the page frozen (nothing appears on screen at all) for</w:t>
       </w:r>
       <w:r>
         <w:t xml:space="preserve"> </w:t>
       </w:r>
       <w:r>
-        <w:t xml:space="preserve">scripts. The problem: all of them fire the instant the page starts loading,</w:t>
+        <w:rPr>
+          <w:bCs/>
+          <w:b/>
+        </w:rPr>
+        <w:t xml:space="preserve">9.6 seconds</w:t>
+      </w:r>
+      <w:r>
+        <w:t xml:space="preserve">, then finishes loading 11 seconds after that. That pattern</w:t>
       </w:r>
       <w:r>
         <w:t xml:space="preserve"> </w:t>
       </w:r>
       <w:r>
-        <w:t xml:space="preserve">competing with your homepage content for bandwidth. Fixing this is a</w:t>
+        <w:t xml:space="preserve">points to one specific culprit — your country-restriction tool, which is</w:t>
       </w:r>
       <w:r>
         <w:t xml:space="preserve"> </w:t>
       </w:r>
       <w:r>
-        <w:t xml:space="preserve">settings change, not a code change.</w:t>
+        <w:t xml:space="preserve">currently set up to hold the entire page from appearing until it finishes</w:t>
+      </w:r>
+      <w:r>
+        <w:t xml:space="preserve"> </w:t>
+      </w:r>
+      <w:r>
+        <w:t xml:space="preserve">checking the visitor’s location. Under certain test conditions, that check</w:t>
+      </w:r>
+      <w:r>
+        <w:t xml:space="preserve"> </w:t>
+      </w:r>
+      <w:r>
+        <w:t xml:space="preserve">appears to take several seconds instead of being instant.</w:t>
+      </w:r>
+    </w:p>
+    <w:p>
+      <w:pPr>
+        <w:pStyle w:val="BodyText"/>
+      </w:pPr>
+      <w:r>
+        <w:rPr>
+          <w:bCs/>
+          <w:b/>
+        </w:rPr>
+        <w:t xml:space="preserve">This is the #1 priority — likely bigger than everything else combined.</w:t>
       </w:r>
     </w:p>
     <w:bookmarkEnd w:id="20"/>
@@ -168,55 +199,59 @@
               <w:jc w:val="left"/>
             </w:pPr>
             <w:r>
-              <w:t xml:space="preserve">1</w:t>
-            </w:r>
-          </w:p>
-        </w:tc>
-        <w:tc>
-          <w:tcPr/>
-          <w:p>
-            <w:pPr>
-              <w:pStyle w:val="Compact"/>
-              <w:jc w:val="left"/>
-            </w:pPr>
-            <w:r>
-              <w:t xml:space="preserve">Crazy Egg, Clarity, Facebook Pixel (104KB), + Google/Bing ad tags all fire at once, on page load</w:t>
-            </w:r>
-          </w:p>
-        </w:tc>
-        <w:tc>
-          <w:tcPr/>
-          <w:p>
-            <w:pPr>
-              <w:pStyle w:val="Compact"/>
-              <w:jc w:val="left"/>
-            </w:pPr>
-            <w:r>
-              <w:t xml:space="preserve">Delay these in Google Tag Manager until scroll/click/tap (or ~4s)</w:t>
-            </w:r>
-          </w:p>
-        </w:tc>
-        <w:tc>
-          <w:tcPr/>
-          <w:p>
-            <w:pPr>
-              <w:pStyle w:val="Compact"/>
-              <w:jc w:val="left"/>
-            </w:pPr>
-            <w:r>
-              <w:t xml:space="preserve">GTM account holder</w:t>
-            </w:r>
-          </w:p>
-        </w:tc>
-        <w:tc>
-          <w:tcPr/>
-          <w:p>
-            <w:pPr>
-              <w:pStyle w:val="Compact"/>
-              <w:jc w:val="left"/>
-            </w:pPr>
-            <w:r>
-              <w:t xml:space="preserve">~15 min</w:t>
+              <w:t xml:space="preserve">0</w:t>
+            </w:r>
+          </w:p>
+        </w:tc>
+        <w:tc>
+          <w:tcPr/>
+          <w:p>
+            <w:pPr>
+              <w:pStyle w:val="Compact"/>
+              <w:jc w:val="left"/>
+            </w:pPr>
+            <w:r>
+              <w:rPr>
+                <w:bCs/>
+                <w:b/>
+              </w:rPr>
+              <w:t xml:space="preserve">Country-restriction tool holds the whole page from appearing while it checks the visitor’s location — likely the main cause of the reported slowdown</w:t>
+            </w:r>
+          </w:p>
+        </w:tc>
+        <w:tc>
+          <w:tcPr/>
+          <w:p>
+            <w:pPr>
+              <w:pStyle w:val="Compact"/>
+              <w:jc w:val="left"/>
+            </w:pPr>
+            <w:r>
+              <w:t xml:space="preserve">Test with it briefly disabled to confirm, then ask the vendor for a non-blocking check method</w:t>
+            </w:r>
+          </w:p>
+        </w:tc>
+        <w:tc>
+          <w:tcPr/>
+          <w:p>
+            <w:pPr>
+              <w:pStyle w:val="Compact"/>
+              <w:jc w:val="left"/>
+            </w:pPr>
+            <w:r>
+              <w:t xml:space="preserve">App vendor</w:t>
+            </w:r>
+          </w:p>
+        </w:tc>
+        <w:tc>
+          <w:tcPr/>
+          <w:p>
+            <w:pPr>
+              <w:pStyle w:val="Compact"/>
+              <w:jc w:val="left"/>
+            </w:pPr>
+            <w:r>
+              <w:t xml:space="preserve">~10 min to confirm</w:t>
             </w:r>
           </w:p>
         </w:tc>
@@ -230,55 +265,55 @@
               <w:jc w:val="left"/>
             </w:pPr>
             <w:r>
-              <w:t xml:space="preserve">2</w:t>
-            </w:r>
-          </w:p>
-        </w:tc>
-        <w:tc>
-          <w:tcPr/>
-          <w:p>
-            <w:pPr>
-              <w:pStyle w:val="Compact"/>
-              <w:jc w:val="left"/>
-            </w:pPr>
-            <w:r>
-              <w:t xml:space="preserve">ClickCease also fires at once</w:t>
-            </w:r>
-          </w:p>
-        </w:tc>
-        <w:tc>
-          <w:tcPr/>
-          <w:p>
-            <w:pPr>
-              <w:pStyle w:val="Compact"/>
-              <w:jc w:val="left"/>
-            </w:pPr>
-            <w:r>
-              <w:t xml:space="preserve">Keep it fast (fraud protection needs speed) — no change needed</w:t>
-            </w:r>
-          </w:p>
-        </w:tc>
-        <w:tc>
-          <w:tcPr/>
-          <w:p>
-            <w:pPr>
-              <w:pStyle w:val="Compact"/>
-              <w:jc w:val="left"/>
-            </w:pPr>
-            <w:r>
-              <w:t xml:space="preserve">—</w:t>
-            </w:r>
-          </w:p>
-        </w:tc>
-        <w:tc>
-          <w:tcPr/>
-          <w:p>
-            <w:pPr>
-              <w:pStyle w:val="Compact"/>
-              <w:jc w:val="left"/>
-            </w:pPr>
-            <w:r>
-              <w:t xml:space="preserve">—</w:t>
+              <w:t xml:space="preserve">1</w:t>
+            </w:r>
+          </w:p>
+        </w:tc>
+        <w:tc>
+          <w:tcPr/>
+          <w:p>
+            <w:pPr>
+              <w:pStyle w:val="Compact"/>
+              <w:jc w:val="left"/>
+            </w:pPr>
+            <w:r>
+              <w:t xml:space="preserve">Crazy Egg, Clarity, Facebook Pixel (104KB), + Google/Bing ad tags all fire at once, on page load</w:t>
+            </w:r>
+          </w:p>
+        </w:tc>
+        <w:tc>
+          <w:tcPr/>
+          <w:p>
+            <w:pPr>
+              <w:pStyle w:val="Compact"/>
+              <w:jc w:val="left"/>
+            </w:pPr>
+            <w:r>
+              <w:t xml:space="preserve">Delay these in Google Tag Manager until scroll/click/tap (or ~4s)</w:t>
+            </w:r>
+          </w:p>
+        </w:tc>
+        <w:tc>
+          <w:tcPr/>
+          <w:p>
+            <w:pPr>
+              <w:pStyle w:val="Compact"/>
+              <w:jc w:val="left"/>
+            </w:pPr>
+            <w:r>
+              <w:t xml:space="preserve">GTM account holder</w:t>
+            </w:r>
+          </w:p>
+        </w:tc>
+        <w:tc>
+          <w:tcPr/>
+          <w:p>
+            <w:pPr>
+              <w:pStyle w:val="Compact"/>
+              <w:jc w:val="left"/>
+            </w:pPr>
+            <w:r>
+              <w:t xml:space="preserve">~15 min</w:t>
             </w:r>
           </w:p>
         </w:tc>
@@ -292,55 +327,55 @@
               <w:jc w:val="left"/>
             </w:pPr>
             <w:r>
-              <w:t xml:space="preserve">3</w:t>
-            </w:r>
-          </w:p>
-        </w:tc>
-        <w:tc>
-          <w:tcPr/>
-          <w:p>
-            <w:pPr>
-              <w:pStyle w:val="Compact"/>
-              <w:jc w:val="left"/>
-            </w:pPr>
-            <w:r>
-              <w:t xml:space="preserve">3 unidentified tracking pixels found outside GTM</w:t>
-            </w:r>
-          </w:p>
-        </w:tc>
-        <w:tc>
-          <w:tcPr/>
-          <w:p>
-            <w:pPr>
-              <w:pStyle w:val="Compact"/>
-              <w:jc w:val="left"/>
-            </w:pPr>
-            <w:r>
-              <w:t xml:space="preserve">Check Shopify Admin → Customer Events for a duplicate Facebook pixel</w:t>
-            </w:r>
-          </w:p>
-        </w:tc>
-        <w:tc>
-          <w:tcPr/>
-          <w:p>
-            <w:pPr>
-              <w:pStyle w:val="Compact"/>
-              <w:jc w:val="left"/>
-            </w:pPr>
-            <w:r>
-              <w:t xml:space="preserve">Shopify Admin</w:t>
-            </w:r>
-          </w:p>
-        </w:tc>
-        <w:tc>
-          <w:tcPr/>
-          <w:p>
-            <w:pPr>
-              <w:pStyle w:val="Compact"/>
-              <w:jc w:val="left"/>
-            </w:pPr>
-            <w:r>
-              <w:t xml:space="preserve">~5 min</w:t>
+              <w:t xml:space="preserve">2</w:t>
+            </w:r>
+          </w:p>
+        </w:tc>
+        <w:tc>
+          <w:tcPr/>
+          <w:p>
+            <w:pPr>
+              <w:pStyle w:val="Compact"/>
+              <w:jc w:val="left"/>
+            </w:pPr>
+            <w:r>
+              <w:t xml:space="preserve">ClickCease also fires at once</w:t>
+            </w:r>
+          </w:p>
+        </w:tc>
+        <w:tc>
+          <w:tcPr/>
+          <w:p>
+            <w:pPr>
+              <w:pStyle w:val="Compact"/>
+              <w:jc w:val="left"/>
+            </w:pPr>
+            <w:r>
+              <w:t xml:space="preserve">Keep it fast (fraud protection needs speed) — no change needed</w:t>
+            </w:r>
+          </w:p>
+        </w:tc>
+        <w:tc>
+          <w:tcPr/>
+          <w:p>
+            <w:pPr>
+              <w:pStyle w:val="Compact"/>
+              <w:jc w:val="left"/>
+            </w:pPr>
+            <w:r>
+              <w:t xml:space="preserve">—</w:t>
+            </w:r>
+          </w:p>
+        </w:tc>
+        <w:tc>
+          <w:tcPr/>
+          <w:p>
+            <w:pPr>
+              <w:pStyle w:val="Compact"/>
+              <w:jc w:val="left"/>
+            </w:pPr>
+            <w:r>
+              <w:t xml:space="preserve">—</w:t>
             </w:r>
           </w:p>
         </w:tc>
@@ -354,55 +389,55 @@
               <w:jc w:val="left"/>
             </w:pPr>
             <w:r>
-              <w:t xml:space="preserve">4</w:t>
-            </w:r>
-          </w:p>
-        </w:tc>
-        <w:tc>
-          <w:tcPr/>
-          <w:p>
-            <w:pPr>
-              <w:pStyle w:val="Compact"/>
-              <w:jc w:val="left"/>
-            </w:pPr>
-            <w:r>
-              <w:t xml:space="preserve">Cookie-consent script (Termly) is the single largest script on the page — bigger than the Facebook Pixel</w:t>
-            </w:r>
-          </w:p>
-        </w:tc>
-        <w:tc>
-          <w:tcPr/>
-          <w:p>
-            <w:pPr>
-              <w:pStyle w:val="Compact"/>
-              <w:jc w:val="left"/>
-            </w:pPr>
-            <w:r>
-              <w:t xml:space="preserve">Ask Termly if it can load without breaking consent enforcement, before we touch it</w:t>
-            </w:r>
-          </w:p>
-        </w:tc>
-        <w:tc>
-          <w:tcPr/>
-          <w:p>
-            <w:pPr>
-              <w:pStyle w:val="Compact"/>
-              <w:jc w:val="left"/>
-            </w:pPr>
-            <w:r>
-              <w:t xml:space="preserve">Termly support</w:t>
-            </w:r>
-          </w:p>
-        </w:tc>
-        <w:tc>
-          <w:tcPr/>
-          <w:p>
-            <w:pPr>
-              <w:pStyle w:val="Compact"/>
-              <w:jc w:val="left"/>
-            </w:pPr>
-            <w:r>
-              <w:t xml:space="preserve">Pending their reply</w:t>
+              <w:t xml:space="preserve">3</w:t>
+            </w:r>
+          </w:p>
+        </w:tc>
+        <w:tc>
+          <w:tcPr/>
+          <w:p>
+            <w:pPr>
+              <w:pStyle w:val="Compact"/>
+              <w:jc w:val="left"/>
+            </w:pPr>
+            <w:r>
+              <w:t xml:space="preserve">3 unidentified tracking pixels found outside GTM</w:t>
+            </w:r>
+          </w:p>
+        </w:tc>
+        <w:tc>
+          <w:tcPr/>
+          <w:p>
+            <w:pPr>
+              <w:pStyle w:val="Compact"/>
+              <w:jc w:val="left"/>
+            </w:pPr>
+            <w:r>
+              <w:t xml:space="preserve">Check Shopify Admin → Customer Events for a duplicate Facebook pixel</w:t>
+            </w:r>
+          </w:p>
+        </w:tc>
+        <w:tc>
+          <w:tcPr/>
+          <w:p>
+            <w:pPr>
+              <w:pStyle w:val="Compact"/>
+              <w:jc w:val="left"/>
+            </w:pPr>
+            <w:r>
+              <w:t xml:space="preserve">Shopify Admin</w:t>
+            </w:r>
+          </w:p>
+        </w:tc>
+        <w:tc>
+          <w:tcPr/>
+          <w:p>
+            <w:pPr>
+              <w:pStyle w:val="Compact"/>
+              <w:jc w:val="left"/>
+            </w:pPr>
+            <w:r>
+              <w:t xml:space="preserve">~5 min</w:t>
             </w:r>
           </w:p>
         </w:tc>
@@ -416,43 +451,43 @@
               <w:jc w:val="left"/>
             </w:pPr>
             <w:r>
-              <w:t xml:space="preserve">5</w:t>
-            </w:r>
-          </w:p>
-        </w:tc>
-        <w:tc>
-          <w:tcPr/>
-          <w:p>
-            <w:pPr>
-              <w:pStyle w:val="Compact"/>
-              <w:jc w:val="left"/>
-            </w:pPr>
-            <w:r>
-              <w:t xml:space="preserve">Country-restriction tool intentionally delays page render</w:t>
-            </w:r>
-          </w:p>
-        </w:tc>
-        <w:tc>
-          <w:tcPr/>
-          <w:p>
-            <w:pPr>
-              <w:pStyle w:val="Compact"/>
-              <w:jc w:val="left"/>
-            </w:pPr>
-            <w:r>
-              <w:t xml:space="preserve">Confirm with vendor if a faster mode exists</w:t>
-            </w:r>
-          </w:p>
-        </w:tc>
-        <w:tc>
-          <w:tcPr/>
-          <w:p>
-            <w:pPr>
-              <w:pStyle w:val="Compact"/>
-              <w:jc w:val="left"/>
-            </w:pPr>
-            <w:r>
-              <w:t xml:space="preserve">App vendor</w:t>
+              <w:t xml:space="preserve">4</w:t>
+            </w:r>
+          </w:p>
+        </w:tc>
+        <w:tc>
+          <w:tcPr/>
+          <w:p>
+            <w:pPr>
+              <w:pStyle w:val="Compact"/>
+              <w:jc w:val="left"/>
+            </w:pPr>
+            <w:r>
+              <w:t xml:space="preserve">Cookie-consent script (Termly) is the single largest script on the page — bigger than the Facebook Pixel</w:t>
+            </w:r>
+          </w:p>
+        </w:tc>
+        <w:tc>
+          <w:tcPr/>
+          <w:p>
+            <w:pPr>
+              <w:pStyle w:val="Compact"/>
+              <w:jc w:val="left"/>
+            </w:pPr>
+            <w:r>
+              <w:t xml:space="preserve">Ask Termly if it can load without breaking consent enforcement, before we touch it</w:t>
+            </w:r>
+          </w:p>
+        </w:tc>
+        <w:tc>
+          <w:tcPr/>
+          <w:p>
+            <w:pPr>
+              <w:pStyle w:val="Compact"/>
+              <w:jc w:val="left"/>
+            </w:pPr>
+            <w:r>
+              <w:t xml:space="preserve">Termly support</w:t>
             </w:r>
           </w:p>
         </w:tc>
@@ -501,19 +536,25 @@
         <w:t xml:space="preserve"> </w:t>
       </w:r>
       <w:r>
-        <w:t xml:space="preserve">— stopping background scripts from competing with your content on</w:t>
+        <w:t xml:space="preserve">— stopping one blocking check and background scripts from</w:t>
       </w:r>
       <w:r>
         <w:t xml:space="preserve"> </w:t>
       </w:r>
       <w:r>
-        <w:t xml:space="preserve">first load. Item 1 is the biggest win and can be done today with no</w:t>
+        <w:t xml:space="preserve">competing with your content on first load. Item 0 is the fastest way to</w:t>
       </w:r>
       <w:r>
         <w:t xml:space="preserve"> </w:t>
       </w:r>
       <w:r>
-        <w:t xml:space="preserve">development work.</w:t>
+        <w:t xml:space="preserve">confirm the biggest lever; item 1 is the biggest win that needs no</w:t>
+      </w:r>
+      <w:r>
+        <w:t xml:space="preserve"> </w:t>
+      </w:r>
+      <w:r>
+        <w:t xml:space="preserve">development work at all.</w:t>
       </w:r>
     </w:p>
     <w:bookmarkEnd w:id="22"/>

</xml_diff>